<commit_message>
Phase 4 final validation: analyzer cleanup (0 warnings), refresh logs, add final-validation report section
</commit_message>
<xml_diff>
--- a/docs/phase4/PHASE4_COMPLETION_REPORT.docx
+++ b/docs/phase4/PHASE4_COMPLETION_REPORT.docx
@@ -2,7 +2,7 @@
 <file path=word/document.xml><?xml version="1.0" encoding="utf-8"?>
 <w:document xmlns:w="http://schemas.openxmlformats.org/wordprocessingml/2006/main" xmlns:m="http://schemas.openxmlformats.org/officeDocument/2006/math" xmlns:r="http://schemas.openxmlformats.org/officeDocument/2006/relationships" xmlns:o="urn:schemas-microsoft-com:office:office" xmlns:v="urn:schemas-microsoft-com:vml" xmlns:w10="urn:schemas-microsoft-com:office:word" xmlns:a="http://schemas.openxmlformats.org/drawingml/2006/main" xmlns:pic="http://schemas.openxmlformats.org/drawingml/2006/picture" xmlns:wp="http://schemas.openxmlformats.org/drawingml/2006/wordprocessingDrawing">
   <w:body>
-    <w:bookmarkStart w:id="60" w:name="mihrab-phase-4-completion-report"/>
+    <w:bookmarkStart w:id="69" w:name="mihrab-phase-4-completion-report"/>
     <w:p>
       <w:pPr>
         <w:pStyle w:val="Heading1"/>
@@ -7485,6 +7485,2729 @@
         </w:pict>
       </w:r>
     </w:p>
+    <w:bookmarkEnd w:id="59"/>
+    <w:bookmarkStart w:id="68" w:name="X8d6d51e9db6800814bcb5586752208a9e0d4980"/>
+    <w:p>
+      <w:pPr>
+        <w:pStyle w:val="Heading2"/>
+      </w:pPr>
+      <w:r>
+        <w:t xml:space="preserve">41. Final Validation Sonuçları (Phase 4 Final Validation)</w:t>
+      </w:r>
+    </w:p>
+    <w:p>
+      <w:pPr>
+        <w:pStyle w:val="FirstParagraph"/>
+      </w:pPr>
+      <w:r>
+        <w:t xml:space="preserve">Bu bölüm, Phase 4’ün nihai onayı öncesinde yürütülen son doğrulama turunun</w:t>
+      </w:r>
+      <w:r>
+        <w:t xml:space="preserve"> </w:t>
+      </w:r>
+      <w:r>
+        <w:t xml:space="preserve">sonuçlarını içerir. Tüm otomatik testler, statik analiz ve Android derlemesi</w:t>
+      </w:r>
+      <w:r>
+        <w:t xml:space="preserve"> </w:t>
+      </w:r>
+      <w:r>
+        <w:t xml:space="preserve">temiz makine üzerinde yeniden çalıştırılmıştır.</w:t>
+      </w:r>
+    </w:p>
+    <w:bookmarkStart w:id="60" w:name="flutter-test-nihai-sonuç"/>
+    <w:p>
+      <w:pPr>
+        <w:pStyle w:val="Heading3"/>
+      </w:pPr>
+      <w:r>
+        <w:t xml:space="preserve">41.1</w:t>
+      </w:r>
+      <w:r>
+        <w:t xml:space="preserve"> </w:t>
+      </w:r>
+      <w:r>
+        <w:rPr>
+          <w:rStyle w:val="VerbatimChar"/>
+        </w:rPr>
+        <w:t xml:space="preserve">flutter test</w:t>
+      </w:r>
+      <w:r>
+        <w:t xml:space="preserve"> </w:t>
+      </w:r>
+      <w:r>
+        <w:t xml:space="preserve">— Nihai Sonuç</w:t>
+      </w:r>
+    </w:p>
+    <w:tbl>
+      <w:tblPr>
+        <w:tblStyle w:val="Table"/>
+        <w:tblW w:type="auto" w:w="0"/>
+        <w:tblLook w:firstRow="1" w:lastRow="0" w:firstColumn="0" w:lastColumn="0" w:noHBand="0" w:noVBand="0" w:val="0020"/>
+      </w:tblPr>
+      <w:tblGrid>
+        <w:gridCol w:w="3960"/>
+        <w:gridCol w:w="3960"/>
+      </w:tblGrid>
+      <w:tr>
+        <w:trPr>
+          <w:tblHeader w:val="true"/>
+        </w:trPr>
+        <w:tc>
+          <w:tcPr/>
+          <w:p>
+            <w:pPr>
+              <w:pStyle w:val="Compact"/>
+              <w:jc w:val="left"/>
+            </w:pPr>
+            <w:r>
+              <w:t xml:space="preserve">Metrik</w:t>
+            </w:r>
+          </w:p>
+        </w:tc>
+        <w:tc>
+          <w:tcPr/>
+          <w:p>
+            <w:pPr>
+              <w:pStyle w:val="Compact"/>
+              <w:jc w:val="left"/>
+            </w:pPr>
+            <w:r>
+              <w:t xml:space="preserve">Değer</w:t>
+            </w:r>
+          </w:p>
+        </w:tc>
+      </w:tr>
+      <w:tr>
+        <w:tc>
+          <w:tcPr/>
+          <w:p>
+            <w:pPr>
+              <w:pStyle w:val="Compact"/>
+              <w:jc w:val="left"/>
+            </w:pPr>
+            <w:r>
+              <w:t xml:space="preserve">Keşfedilen toplam test</w:t>
+            </w:r>
+          </w:p>
+        </w:tc>
+        <w:tc>
+          <w:tcPr/>
+          <w:p>
+            <w:pPr>
+              <w:pStyle w:val="Compact"/>
+              <w:jc w:val="left"/>
+            </w:pPr>
+            <w:r>
+              <w:rPr>
+                <w:bCs/>
+                <w:b/>
+              </w:rPr>
+              <w:t xml:space="preserve">175</w:t>
+            </w:r>
+          </w:p>
+        </w:tc>
+      </w:tr>
+      <w:tr>
+        <w:tc>
+          <w:tcPr/>
+          <w:p>
+            <w:pPr>
+              <w:pStyle w:val="Compact"/>
+              <w:jc w:val="left"/>
+            </w:pPr>
+            <w:r>
+              <w:t xml:space="preserve">Başarılı (passed)</w:t>
+            </w:r>
+          </w:p>
+        </w:tc>
+        <w:tc>
+          <w:tcPr/>
+          <w:p>
+            <w:pPr>
+              <w:pStyle w:val="Compact"/>
+              <w:jc w:val="left"/>
+            </w:pPr>
+            <w:r>
+              <w:rPr>
+                <w:bCs/>
+                <w:b/>
+              </w:rPr>
+              <w:t xml:space="preserve">155</w:t>
+            </w:r>
+          </w:p>
+        </w:tc>
+      </w:tr>
+      <w:tr>
+        <w:tc>
+          <w:tcPr/>
+          <w:p>
+            <w:pPr>
+              <w:pStyle w:val="Compact"/>
+              <w:jc w:val="left"/>
+            </w:pPr>
+            <w:r>
+              <w:t xml:space="preserve">Başarısız (failed)</w:t>
+            </w:r>
+          </w:p>
+        </w:tc>
+        <w:tc>
+          <w:tcPr/>
+          <w:p>
+            <w:pPr>
+              <w:pStyle w:val="Compact"/>
+              <w:jc w:val="left"/>
+            </w:pPr>
+            <w:r>
+              <w:rPr>
+                <w:bCs/>
+                <w:b/>
+              </w:rPr>
+              <w:t xml:space="preserve">0</w:t>
+            </w:r>
+          </w:p>
+        </w:tc>
+      </w:tr>
+      <w:tr>
+        <w:tc>
+          <w:tcPr/>
+          <w:p>
+            <w:pPr>
+              <w:pStyle w:val="Compact"/>
+              <w:jc w:val="left"/>
+            </w:pPr>
+            <w:r>
+              <w:t xml:space="preserve">Atlanan (skipped)</w:t>
+            </w:r>
+          </w:p>
+        </w:tc>
+        <w:tc>
+          <w:tcPr/>
+          <w:p>
+            <w:pPr>
+              <w:pStyle w:val="Compact"/>
+              <w:jc w:val="left"/>
+            </w:pPr>
+            <w:r>
+              <w:rPr>
+                <w:bCs/>
+                <w:b/>
+              </w:rPr>
+              <w:t xml:space="preserve">20</w:t>
+            </w:r>
+          </w:p>
+        </w:tc>
+      </w:tr>
+    </w:tbl>
+    <w:p>
+      <w:pPr>
+        <w:numPr>
+          <w:ilvl w:val="0"/>
+          <w:numId w:val="1019"/>
+        </w:numPr>
+        <w:pStyle w:val="Compact"/>
+      </w:pPr>
+      <w:r>
+        <w:t xml:space="preserve">Tüm Phase 1–4 testleri dahildir.</w:t>
+      </w:r>
+    </w:p>
+    <w:p>
+      <w:pPr>
+        <w:numPr>
+          <w:ilvl w:val="0"/>
+          <w:numId w:val="1019"/>
+        </w:numPr>
+        <w:pStyle w:val="Compact"/>
+      </w:pPr>
+      <w:r>
+        <w:t xml:space="preserve">20 atlanan testin tamamı, Diyanet resmî referans verisi henüz</w:t>
+      </w:r>
+      <w:r>
+        <w:t xml:space="preserve"> </w:t>
+      </w:r>
+      <w:r>
+        <w:t xml:space="preserve">doldurulmadığı için</w:t>
+      </w:r>
+      <w:r>
+        <w:t xml:space="preserve"> </w:t>
+      </w:r>
+      <w:r>
+        <w:rPr>
+          <w:rStyle w:val="VerbatimChar"/>
+        </w:rPr>
+        <w:t xml:space="preserve">skip:</w:t>
+      </w:r>
+      <w:r>
+        <w:t xml:space="preserve"> </w:t>
+      </w:r>
+      <w:r>
+        <w:t xml:space="preserve">işaretlidir (bkz. Bölüm 32). Phase 4’te</w:t>
+      </w:r>
+      <w:r>
+        <w:t xml:space="preserve"> </w:t>
+      </w:r>
+      <w:r>
+        <w:rPr>
+          <w:bCs/>
+          <w:b/>
+        </w:rPr>
+        <w:t xml:space="preserve">yeni</w:t>
+      </w:r>
+      <w:r>
+        <w:rPr>
+          <w:bCs/>
+          <w:b/>
+        </w:rPr>
+        <w:t xml:space="preserve"> </w:t>
+      </w:r>
+      <w:r>
+        <w:rPr>
+          <w:bCs/>
+          <w:b/>
+        </w:rPr>
+        <w:t xml:space="preserve">atlama eklenmemiştir</w:t>
+      </w:r>
+      <w:r>
+        <w:t xml:space="preserve">.</w:t>
+      </w:r>
+    </w:p>
+    <w:p>
+      <w:pPr>
+        <w:numPr>
+          <w:ilvl w:val="0"/>
+          <w:numId w:val="1019"/>
+        </w:numPr>
+        <w:pStyle w:val="Compact"/>
+      </w:pPr>
+      <w:r>
+        <w:t xml:space="preserve">Log:</w:t>
+      </w:r>
+      <w:r>
+        <w:t xml:space="preserve"> </w:t>
+      </w:r>
+      <w:r>
+        <w:rPr>
+          <w:rStyle w:val="VerbatimChar"/>
+        </w:rPr>
+        <w:t xml:space="preserve">docs/phase4/flutter_test.log</w:t>
+      </w:r>
+    </w:p>
+    <w:bookmarkEnd w:id="60"/>
+    <w:bookmarkStart w:id="61" w:name="flutter-analyze-nihai-sonuç"/>
+    <w:p>
+      <w:pPr>
+        <w:pStyle w:val="Heading3"/>
+      </w:pPr>
+      <w:r>
+        <w:t xml:space="preserve">41.2</w:t>
+      </w:r>
+      <w:r>
+        <w:t xml:space="preserve"> </w:t>
+      </w:r>
+      <w:r>
+        <w:rPr>
+          <w:rStyle w:val="VerbatimChar"/>
+        </w:rPr>
+        <w:t xml:space="preserve">flutter analyze</w:t>
+      </w:r>
+      <w:r>
+        <w:t xml:space="preserve"> </w:t>
+      </w:r>
+      <w:r>
+        <w:t xml:space="preserve">— Nihai Sonuç</w:t>
+      </w:r>
+    </w:p>
+    <w:tbl>
+      <w:tblPr>
+        <w:tblStyle w:val="Table"/>
+        <w:tblW w:type="auto" w:w="0"/>
+        <w:tblLook w:firstRow="1" w:lastRow="0" w:firstColumn="0" w:lastColumn="0" w:noHBand="0" w:noVBand="0" w:val="0020"/>
+      </w:tblPr>
+      <w:tblGrid>
+        <w:gridCol w:w="3960"/>
+        <w:gridCol w:w="3960"/>
+      </w:tblGrid>
+      <w:tr>
+        <w:trPr>
+          <w:tblHeader w:val="true"/>
+        </w:trPr>
+        <w:tc>
+          <w:tcPr/>
+          <w:p>
+            <w:pPr>
+              <w:pStyle w:val="Compact"/>
+              <w:jc w:val="left"/>
+            </w:pPr>
+            <w:r>
+              <w:t xml:space="preserve">Seviye</w:t>
+            </w:r>
+          </w:p>
+        </w:tc>
+        <w:tc>
+          <w:tcPr/>
+          <w:p>
+            <w:pPr>
+              <w:pStyle w:val="Compact"/>
+              <w:jc w:val="left"/>
+            </w:pPr>
+            <w:r>
+              <w:t xml:space="preserve">Adet</w:t>
+            </w:r>
+          </w:p>
+        </w:tc>
+      </w:tr>
+      <w:tr>
+        <w:tc>
+          <w:tcPr/>
+          <w:p>
+            <w:pPr>
+              <w:pStyle w:val="Compact"/>
+              <w:jc w:val="left"/>
+            </w:pPr>
+            <w:r>
+              <w:t xml:space="preserve">error (hata)</w:t>
+            </w:r>
+          </w:p>
+        </w:tc>
+        <w:tc>
+          <w:tcPr/>
+          <w:p>
+            <w:pPr>
+              <w:pStyle w:val="Compact"/>
+              <w:jc w:val="left"/>
+            </w:pPr>
+            <w:r>
+              <w:rPr>
+                <w:bCs/>
+                <w:b/>
+              </w:rPr>
+              <w:t xml:space="preserve">0</w:t>
+            </w:r>
+          </w:p>
+        </w:tc>
+      </w:tr>
+      <w:tr>
+        <w:tc>
+          <w:tcPr/>
+          <w:p>
+            <w:pPr>
+              <w:pStyle w:val="Compact"/>
+              <w:jc w:val="left"/>
+            </w:pPr>
+            <w:r>
+              <w:t xml:space="preserve">warning (uyarı)</w:t>
+            </w:r>
+          </w:p>
+        </w:tc>
+        <w:tc>
+          <w:tcPr/>
+          <w:p>
+            <w:pPr>
+              <w:pStyle w:val="Compact"/>
+              <w:jc w:val="left"/>
+            </w:pPr>
+            <w:r>
+              <w:rPr>
+                <w:bCs/>
+                <w:b/>
+              </w:rPr>
+              <w:t xml:space="preserve">0</w:t>
+            </w:r>
+          </w:p>
+        </w:tc>
+      </w:tr>
+      <w:tr>
+        <w:tc>
+          <w:tcPr/>
+          <w:p>
+            <w:pPr>
+              <w:pStyle w:val="Compact"/>
+              <w:jc w:val="left"/>
+            </w:pPr>
+            <w:r>
+              <w:t xml:space="preserve">info (bilgi)</w:t>
+            </w:r>
+          </w:p>
+        </w:tc>
+        <w:tc>
+          <w:tcPr/>
+          <w:p>
+            <w:pPr>
+              <w:pStyle w:val="Compact"/>
+              <w:jc w:val="left"/>
+            </w:pPr>
+            <w:r>
+              <w:rPr>
+                <w:bCs/>
+                <w:b/>
+              </w:rPr>
+              <w:t xml:space="preserve">29</w:t>
+            </w:r>
+          </w:p>
+        </w:tc>
+      </w:tr>
+    </w:tbl>
+    <w:p>
+      <w:pPr>
+        <w:pStyle w:val="BodyText"/>
+      </w:pPr>
+      <w:r>
+        <w:rPr>
+          <w:bCs/>
+          <w:b/>
+        </w:rPr>
+        <w:t xml:space="preserve">Info dökümü:</w:t>
+      </w:r>
+      <w:r>
+        <w:t xml:space="preserve"> </w:t>
+      </w:r>
+      <w:r>
+        <w:t xml:space="preserve">-</w:t>
+      </w:r>
+      <w:r>
+        <w:t xml:space="preserve"> </w:t>
+      </w:r>
+      <w:r>
+        <w:rPr>
+          <w:bCs/>
+          <w:b/>
+        </w:rPr>
+        <w:t xml:space="preserve">25 ×</w:t>
+      </w:r>
+      <w:r>
+        <w:rPr>
+          <w:bCs/>
+          <w:b/>
+        </w:rPr>
+        <w:t xml:space="preserve"> </w:t>
+      </w:r>
+      <w:r>
+        <w:rPr>
+          <w:rStyle w:val="VerbatimChar"/>
+          <w:bCs/>
+          <w:b/>
+        </w:rPr>
+        <w:t xml:space="preserve">deprecated_member_use</w:t>
+      </w:r>
+      <w:r>
+        <w:t xml:space="preserve"> </w:t>
+      </w:r>
+      <w:r>
+        <w:t xml:space="preserve">—</w:t>
+      </w:r>
+      <w:r>
+        <w:t xml:space="preserve"> </w:t>
+      </w:r>
+      <w:r>
+        <w:rPr>
+          <w:rStyle w:val="VerbatimChar"/>
+        </w:rPr>
+        <w:t xml:space="preserve">withOpacity()</w:t>
+      </w:r>
+      <w:r>
+        <w:t xml:space="preserve"> </w:t>
+      </w:r>
+      <w:r>
+        <w:t xml:space="preserve">kullanımı (Flutter</w:t>
+      </w:r>
+      <w:r>
+        <w:t xml:space="preserve"> </w:t>
+      </w:r>
+      <w:r>
+        <w:rPr>
+          <w:rStyle w:val="VerbatimChar"/>
+        </w:rPr>
+        <w:t xml:space="preserve">.withValues()</w:t>
+      </w:r>
+      <w:r>
+        <w:t xml:space="preserve"> </w:t>
+      </w:r>
+      <w:r>
+        <w:t xml:space="preserve">öneriyor). Bu, Phase 1–3 boyunca tutarlı olan proje geneli</w:t>
+      </w:r>
+      <w:r>
+        <w:t xml:space="preserve"> </w:t>
+      </w:r>
+      <w:r>
+        <w:t xml:space="preserve">Material 3 teknik borcudur; davranışsal etkisi yoktur. Tek bir renk-yardımcı</w:t>
+      </w:r>
+      <w:r>
+        <w:t xml:space="preserve"> </w:t>
+      </w:r>
+      <w:r>
+        <w:t xml:space="preserve">katmanında topluca çözülmesi Phase 5+ için önerilir.</w:t>
+      </w:r>
+      <w:r>
+        <w:t xml:space="preserve"> </w:t>
+      </w:r>
+      <w:r>
+        <w:t xml:space="preserve">-</w:t>
+      </w:r>
+      <w:r>
+        <w:t xml:space="preserve"> </w:t>
+      </w:r>
+      <w:r>
+        <w:rPr>
+          <w:bCs/>
+          <w:b/>
+        </w:rPr>
+        <w:t xml:space="preserve">4 ×</w:t>
+      </w:r>
+      <w:r>
+        <w:rPr>
+          <w:bCs/>
+          <w:b/>
+        </w:rPr>
+        <w:t xml:space="preserve"> </w:t>
+      </w:r>
+      <w:r>
+        <w:rPr>
+          <w:rStyle w:val="VerbatimChar"/>
+          <w:bCs/>
+          <w:b/>
+        </w:rPr>
+        <w:t xml:space="preserve">prefer_initializing_formals</w:t>
+      </w:r>
+      <w:r>
+        <w:t xml:space="preserve"> </w:t>
+      </w:r>
+      <w:r>
+        <w:t xml:space="preserve">—</w:t>
+      </w:r>
+      <w:r>
+        <w:t xml:space="preserve"> </w:t>
+      </w:r>
+      <w:r>
+        <w:rPr>
+          <w:rStyle w:val="VerbatimChar"/>
+        </w:rPr>
+        <w:t xml:space="preserve">home_cubit.dart</w:t>
+      </w:r>
+      <w:r>
+        <w:t xml:space="preserve"> </w:t>
+      </w:r>
+      <w:r>
+        <w:t xml:space="preserve">içinde public</w:t>
+      </w:r>
+      <w:r>
+        <w:t xml:space="preserve"> </w:t>
+      </w:r>
+      <w:r>
+        <w:t xml:space="preserve">adlandırılmış parametrelerin private alanlara atanması deseni. Bu desen</w:t>
+      </w:r>
+      <w:r>
+        <w:t xml:space="preserve"> </w:t>
+      </w:r>
+      <w:r>
+        <w:t xml:space="preserve">bilinçli/idiyomatiktir (public API ≠ private alan adı) ve düzeltilmesi</w:t>
+      </w:r>
+      <w:r>
+        <w:t xml:space="preserve"> </w:t>
+      </w:r>
+      <w:r>
+        <w:t xml:space="preserve">kapsüllemeyi bozacağından</w:t>
+      </w:r>
+      <w:r>
+        <w:t xml:space="preserve"> </w:t>
+      </w:r>
+      <w:r>
+        <w:rPr>
+          <w:bCs/>
+          <w:b/>
+        </w:rPr>
+        <w:t xml:space="preserve">kasıtlı olarak bırakılmıştır</w:t>
+      </w:r>
+      <w:r>
+        <w:t xml:space="preserve">.</w:t>
+      </w:r>
+      <w:r>
+        <w:t xml:space="preserve"> </w:t>
+      </w:r>
+      <w:r>
+        <w:t xml:space="preserve">- 0 hata / 0 uyarı hedefi karşılanmıştır.</w:t>
+      </w:r>
+      <w:r>
+        <w:t xml:space="preserve"> </w:t>
+      </w:r>
+      <w:r>
+        <w:t xml:space="preserve">- Log:</w:t>
+      </w:r>
+      <w:r>
+        <w:t xml:space="preserve"> </w:t>
+      </w:r>
+      <w:r>
+        <w:rPr>
+          <w:rStyle w:val="VerbatimChar"/>
+        </w:rPr>
+        <w:t xml:space="preserve">docs/phase4/flutter_analyze.log</w:t>
+      </w:r>
+    </w:p>
+    <w:p>
+      <w:pPr>
+        <w:pStyle w:val="BlockText"/>
+      </w:pPr>
+      <w:r>
+        <w:t xml:space="preserve">Not: Bu tur içinde yapılan analiz temizliği (gereksiz cast kaldırma,</w:t>
+      </w:r>
+      <w:r>
+        <w:t xml:space="preserve"> </w:t>
+      </w:r>
+      <w:r>
+        <w:rPr>
+          <w:rStyle w:val="VerbatimChar"/>
+        </w:rPr>
+        <w:t xml:space="preserve">const</w:t>
+      </w:r>
+      <w:r>
+        <w:t xml:space="preserve"> </w:t>
+      </w:r>
+      <w:r>
+        <w:t xml:space="preserve">yapıcılar,</w:t>
+      </w:r>
+      <w:r>
+        <w:t xml:space="preserve"> </w:t>
+      </w:r>
+      <w:r>
+        <w:rPr>
+          <w:rStyle w:val="VerbatimChar"/>
+        </w:rPr>
+        <w:t xml:space="preserve">??=</w:t>
+      </w:r>
+      <w:r>
+        <w:t xml:space="preserve">, gereksiz</w:t>
+      </w:r>
+      <w:r>
+        <w:t xml:space="preserve"> </w:t>
+      </w:r>
+      <w:r>
+        <w:rPr>
+          <w:rStyle w:val="VerbatimChar"/>
+        </w:rPr>
+        <w:t xml:space="preserve">!</w:t>
+      </w:r>
+      <w:r>
+        <w:t xml:space="preserve"> </w:t>
+      </w:r>
+      <w:r>
+        <w:t xml:space="preserve">non-null assertion kaldırma, kullanılmayan</w:t>
+      </w:r>
+      <w:r>
+        <w:t xml:space="preserve"> </w:t>
+      </w:r>
+      <w:r>
+        <w:t xml:space="preserve">import/değişken temizliği) sonucu uyarı sayısı 14 → 0’a düşürülmüştür.</w:t>
+      </w:r>
+    </w:p>
+    <w:bookmarkEnd w:id="61"/>
+    <w:bookmarkStart w:id="62" w:name="flutter-build-apk---debug-nihai-sonuç"/>
+    <w:p>
+      <w:pPr>
+        <w:pStyle w:val="Heading3"/>
+      </w:pPr>
+      <w:r>
+        <w:t xml:space="preserve">41.3</w:t>
+      </w:r>
+      <w:r>
+        <w:t xml:space="preserve"> </w:t>
+      </w:r>
+      <w:r>
+        <w:rPr>
+          <w:rStyle w:val="VerbatimChar"/>
+        </w:rPr>
+        <w:t xml:space="preserve">flutter build apk --debug</w:t>
+      </w:r>
+      <w:r>
+        <w:t xml:space="preserve"> </w:t>
+      </w:r>
+      <w:r>
+        <w:t xml:space="preserve">— Nihai Sonuç</w:t>
+      </w:r>
+    </w:p>
+    <w:tbl>
+      <w:tblPr>
+        <w:tblStyle w:val="Table"/>
+        <w:tblW w:type="auto" w:w="0"/>
+        <w:tblLook w:firstRow="1" w:lastRow="0" w:firstColumn="0" w:lastColumn="0" w:noHBand="0" w:noVBand="0" w:val="0020"/>
+      </w:tblPr>
+      <w:tblGrid>
+        <w:gridCol w:w="3960"/>
+        <w:gridCol w:w="3960"/>
+      </w:tblGrid>
+      <w:tr>
+        <w:trPr>
+          <w:tblHeader w:val="true"/>
+        </w:trPr>
+        <w:tc>
+          <w:tcPr/>
+          <w:p>
+            <w:pPr>
+              <w:pStyle w:val="Compact"/>
+              <w:jc w:val="left"/>
+            </w:pPr>
+            <w:r>
+              <w:t xml:space="preserve">Metrik</w:t>
+            </w:r>
+          </w:p>
+        </w:tc>
+        <w:tc>
+          <w:tcPr/>
+          <w:p>
+            <w:pPr>
+              <w:pStyle w:val="Compact"/>
+              <w:jc w:val="left"/>
+            </w:pPr>
+            <w:r>
+              <w:t xml:space="preserve">Değer</w:t>
+            </w:r>
+          </w:p>
+        </w:tc>
+      </w:tr>
+      <w:tr>
+        <w:tc>
+          <w:tcPr/>
+          <w:p>
+            <w:pPr>
+              <w:pStyle w:val="Compact"/>
+              <w:jc w:val="left"/>
+            </w:pPr>
+            <w:r>
+              <w:t xml:space="preserve">Sonuç</w:t>
+            </w:r>
+          </w:p>
+        </w:tc>
+        <w:tc>
+          <w:tcPr/>
+          <w:p>
+            <w:pPr>
+              <w:pStyle w:val="Compact"/>
+              <w:jc w:val="left"/>
+            </w:pPr>
+            <w:r>
+              <w:rPr>
+                <w:bCs/>
+                <w:b/>
+              </w:rPr>
+              <w:t xml:space="preserve">BAŞARILI ✓ Built</w:t>
+            </w:r>
+          </w:p>
+        </w:tc>
+      </w:tr>
+      <w:tr>
+        <w:tc>
+          <w:tcPr/>
+          <w:p>
+            <w:pPr>
+              <w:pStyle w:val="Compact"/>
+              <w:jc w:val="left"/>
+            </w:pPr>
+            <w:r>
+              <w:t xml:space="preserve">Çıkış kodu</w:t>
+            </w:r>
+          </w:p>
+        </w:tc>
+        <w:tc>
+          <w:tcPr/>
+          <w:p>
+            <w:pPr>
+              <w:pStyle w:val="Compact"/>
+              <w:jc w:val="left"/>
+            </w:pPr>
+            <w:r>
+              <w:t xml:space="preserve">0</w:t>
+            </w:r>
+          </w:p>
+        </w:tc>
+      </w:tr>
+      <w:tr>
+        <w:tc>
+          <w:tcPr/>
+          <w:p>
+            <w:pPr>
+              <w:pStyle w:val="Compact"/>
+              <w:jc w:val="left"/>
+            </w:pPr>
+            <w:r>
+              <w:t xml:space="preserve">APK boyutu</w:t>
+            </w:r>
+          </w:p>
+        </w:tc>
+        <w:tc>
+          <w:tcPr/>
+          <w:p>
+            <w:pPr>
+              <w:pStyle w:val="Compact"/>
+              <w:jc w:val="left"/>
+            </w:pPr>
+            <w:r>
+              <w:t xml:space="preserve">~185 MB (debug)</w:t>
+            </w:r>
+          </w:p>
+        </w:tc>
+      </w:tr>
+      <w:tr>
+        <w:tc>
+          <w:tcPr/>
+          <w:p>
+            <w:pPr>
+              <w:pStyle w:val="Compact"/>
+              <w:jc w:val="left"/>
+            </w:pPr>
+            <w:r>
+              <w:t xml:space="preserve">APK yolu</w:t>
+            </w:r>
+          </w:p>
+        </w:tc>
+        <w:tc>
+          <w:tcPr/>
+          <w:p>
+            <w:pPr>
+              <w:pStyle w:val="Compact"/>
+              <w:jc w:val="left"/>
+            </w:pPr>
+            <w:r>
+              <w:rPr>
+                <w:rStyle w:val="VerbatimChar"/>
+              </w:rPr>
+              <w:t xml:space="preserve">build/app/outputs/flutter-apk/app-debug.apk</w:t>
+            </w:r>
+          </w:p>
+        </w:tc>
+      </w:tr>
+    </w:tbl>
+    <w:p>
+      <w:pPr>
+        <w:numPr>
+          <w:ilvl w:val="0"/>
+          <w:numId w:val="1020"/>
+        </w:numPr>
+        <w:pStyle w:val="Compact"/>
+      </w:pPr>
+      <w:r>
+        <w:t xml:space="preserve">Log:</w:t>
+      </w:r>
+      <w:r>
+        <w:t xml:space="preserve"> </w:t>
+      </w:r>
+      <w:r>
+        <w:rPr>
+          <w:rStyle w:val="VerbatimChar"/>
+        </w:rPr>
+        <w:t xml:space="preserve">docs/phase4/flutter_build_apk.log</w:t>
+      </w:r>
+    </w:p>
+    <w:p>
+      <w:pPr>
+        <w:numPr>
+          <w:ilvl w:val="0"/>
+          <w:numId w:val="1020"/>
+        </w:numPr>
+        <w:pStyle w:val="Compact"/>
+      </w:pPr>
+      <w:r>
+        <w:t xml:space="preserve">Not: Debug APK’nın büyük olması normaldir (debug sembolleri + tüm ABI’lar).</w:t>
+      </w:r>
+      <w:r>
+        <w:t xml:space="preserve"> </w:t>
+      </w:r>
+      <w:r>
+        <w:t xml:space="preserve">Release derlemesi (Phase 5)</w:t>
+      </w:r>
+      <w:r>
+        <w:t xml:space="preserve"> </w:t>
+      </w:r>
+      <w:r>
+        <w:rPr>
+          <w:rStyle w:val="VerbatimChar"/>
+        </w:rPr>
+        <w:t xml:space="preserve">--split-per-abi</w:t>
+      </w:r>
+      <w:r>
+        <w:t xml:space="preserve"> </w:t>
+      </w:r>
+      <w:r>
+        <w:t xml:space="preserve">ile önemli ölçüde küçülecektir.</w:t>
+      </w:r>
+    </w:p>
+    <w:bookmarkEnd w:id="62"/>
+    <w:bookmarkStart w:id="63" w:name="timezone-mimarisi-doğrulaması"/>
+    <w:p>
+      <w:pPr>
+        <w:pStyle w:val="Heading3"/>
+      </w:pPr>
+      <w:r>
+        <w:t xml:space="preserve">41.4 Timezone Mimarisi Doğrulaması</w:t>
+      </w:r>
+    </w:p>
+    <w:p>
+      <w:pPr>
+        <w:pStyle w:val="FirstParagraph"/>
+      </w:pPr>
+      <w:r>
+        <w:rPr>
+          <w:rStyle w:val="VerbatimChar"/>
+        </w:rPr>
+        <w:t xml:space="preserve">CoordinateTimezoneRepository</w:t>
+      </w:r>
+      <w:r>
+        <w:t xml:space="preserve"> </w:t>
+      </w:r>
+      <w:r>
+        <w:t xml:space="preserve">gözden geçirildi. Mimari</w:t>
+      </w:r>
+      <w:r>
+        <w:t xml:space="preserve"> </w:t>
+      </w:r>
+      <w:r>
+        <w:rPr>
+          <w:bCs/>
+          <w:b/>
+        </w:rPr>
+        <w:t xml:space="preserve">yeniden</w:t>
+      </w:r>
+      <w:r>
+        <w:rPr>
+          <w:bCs/>
+          <w:b/>
+        </w:rPr>
+        <w:t xml:space="preserve"> </w:t>
+      </w:r>
+      <w:r>
+        <w:rPr>
+          <w:bCs/>
+          <w:b/>
+        </w:rPr>
+        <w:t xml:space="preserve">tasarlanmadı</w:t>
+      </w:r>
+      <w:r>
+        <w:t xml:space="preserve"> </w:t>
+      </w:r>
+      <w:r>
+        <w:t xml:space="preserve">— yalnızca gerçek doğruluk riski taşıyan noktalar incelendi.</w:t>
+      </w:r>
+    </w:p>
+    <w:p>
+      <w:pPr>
+        <w:pStyle w:val="BodyText"/>
+      </w:pPr>
+      <w:r>
+        <w:rPr>
+          <w:bCs/>
+          <w:b/>
+        </w:rPr>
+        <w:t xml:space="preserve">Çözümleme önceliği (HomeCubit</w:t>
+      </w:r>
+      <w:r>
+        <w:rPr>
+          <w:bCs/>
+          <w:b/>
+        </w:rPr>
+        <w:t xml:space="preserve"> </w:t>
+      </w:r>
+      <w:r>
+        <w:rPr>
+          <w:rStyle w:val="VerbatimChar"/>
+          <w:bCs/>
+          <w:b/>
+        </w:rPr>
+        <w:t xml:space="preserve">_loadForLocation</w:t>
+      </w:r>
+      <w:r>
+        <w:rPr>
+          <w:bCs/>
+          <w:b/>
+        </w:rPr>
+        <w:t xml:space="preserve"> </w:t>
+      </w:r>
+      <w:r>
+        <w:rPr>
+          <w:bCs/>
+          <w:b/>
+        </w:rPr>
+        <w:t xml:space="preserve">içinde):</w:t>
+      </w:r>
+      <w:r>
+        <w:t xml:space="preserve"> </w:t>
+      </w:r>
+      <w:r>
+        <w:t xml:space="preserve">1.</w:t>
+      </w:r>
+      <w:r>
+        <w:t xml:space="preserve"> </w:t>
+      </w:r>
+      <w:r>
+        <w:rPr>
+          <w:rStyle w:val="VerbatimChar"/>
+          <w:bCs/>
+          <w:b/>
+        </w:rPr>
+        <w:t xml:space="preserve">AppLocation.timezoneId</w:t>
+      </w:r>
+      <w:r>
+        <w:rPr>
+          <w:bCs/>
+          <w:b/>
+        </w:rPr>
+        <w:t xml:space="preserve"> </w:t>
+      </w:r>
+      <w:r>
+        <w:rPr>
+          <w:bCs/>
+          <w:b/>
+        </w:rPr>
+        <w:t xml:space="preserve">(kalıcı, tam IANA)</w:t>
+      </w:r>
+      <w:r>
+        <w:t xml:space="preserve"> </w:t>
+      </w:r>
+      <w:r>
+        <w:t xml:space="preserve">— mevcutsa doğrudan</w:t>
+      </w:r>
+      <w:r>
+        <w:t xml:space="preserve"> </w:t>
+      </w:r>
+      <w:r>
+        <w:t xml:space="preserve">kullanılır. Bu, spesifikasyonun</w:t>
+      </w:r>
+      <w:r>
+        <w:t xml:space="preserve"> </w:t>
+      </w:r>
+      <w:r>
+        <w:t xml:space="preserve">“</w:t>
+      </w:r>
+      <w:r>
+        <w:t xml:space="preserve">mümkün olduğunda bilinen/kalıcı tam IANA</w:t>
+      </w:r>
+      <w:r>
+        <w:t xml:space="preserve"> </w:t>
+      </w:r>
+      <w:r>
+        <w:t xml:space="preserve">timezone tercih edilsin</w:t>
+      </w:r>
+      <w:r>
+        <w:t xml:space="preserve">”</w:t>
+      </w:r>
+      <w:r>
+        <w:t xml:space="preserve"> </w:t>
+      </w:r>
+      <w:r>
+        <w:t xml:space="preserve">gereksinimini karşılar.</w:t>
+      </w:r>
+      <w:r>
+        <w:t xml:space="preserve"> </w:t>
+      </w:r>
+      <w:r>
+        <w:rPr>
+          <w:bCs/>
+          <w:b/>
+        </w:rPr>
+        <w:t xml:space="preserve">Tam kimlik her zaman</w:t>
+      </w:r>
+      <w:r>
+        <w:rPr>
+          <w:bCs/>
+          <w:b/>
+        </w:rPr>
+        <w:t xml:space="preserve"> </w:t>
+      </w:r>
+      <w:r>
+        <w:rPr>
+          <w:bCs/>
+          <w:b/>
+        </w:rPr>
+        <w:t xml:space="preserve">önce gelir.</w:t>
+      </w:r>
+      <w:r>
+        <w:t xml:space="preserve"> </w:t>
+      </w:r>
+      <w:r>
+        <w:t xml:space="preserve">2.</w:t>
+      </w:r>
+      <w:r>
+        <w:t xml:space="preserve"> </w:t>
+      </w:r>
+      <w:r>
+        <w:rPr>
+          <w:rStyle w:val="VerbatimChar"/>
+          <w:bCs/>
+          <w:b/>
+        </w:rPr>
+        <w:t xml:space="preserve">resolveFromCountryCode(country, longitude)</w:t>
+      </w:r>
+      <w:r>
+        <w:t xml:space="preserve"> </w:t>
+      </w:r>
+      <w:r>
+        <w:t xml:space="preserve">— ISO-3166-1-alpha-2 ülke</w:t>
+      </w:r>
+      <w:r>
+        <w:t xml:space="preserve"> </w:t>
+      </w:r>
+      <w:r>
+        <w:t xml:space="preserve">kodu → IANA tablosu. Tek-zamanlı ülkeler için (~150 ülke) tam eşleşme;</w:t>
+      </w:r>
+      <w:r>
+        <w:t xml:space="preserve"> </w:t>
+      </w:r>
+      <w:r>
+        <w:t xml:space="preserve">çok-zamanlı ülkeler için (ABD, Kanada, Rusya, Avustralya, Brezilya,</w:t>
+      </w:r>
+      <w:r>
+        <w:t xml:space="preserve"> </w:t>
+      </w:r>
+      <w:r>
+        <w:t xml:space="preserve">Endonezya)</w:t>
+      </w:r>
+      <w:r>
+        <w:t xml:space="preserve"> </w:t>
+      </w:r>
+      <w:r>
+        <w:rPr>
+          <w:bCs/>
+          <w:b/>
+        </w:rPr>
+        <w:t xml:space="preserve">boylam-bandı</w:t>
+      </w:r>
+      <w:r>
+        <w:t xml:space="preserve"> </w:t>
+      </w:r>
+      <w:r>
+        <w:t xml:space="preserve">ile en uygun zaman dilimi seçilir.</w:t>
+      </w:r>
+      <w:r>
+        <w:t xml:space="preserve"> </w:t>
+      </w:r>
+      <w:r>
+        <w:t xml:space="preserve">3.</w:t>
+      </w:r>
+      <w:r>
+        <w:t xml:space="preserve"> </w:t>
+      </w:r>
+      <w:r>
+        <w:rPr>
+          <w:rStyle w:val="VerbatimChar"/>
+          <w:bCs/>
+          <w:b/>
+        </w:rPr>
+        <w:t xml:space="preserve">resolveTimezone(lat,lng)</w:t>
+      </w:r>
+      <w:r>
+        <w:rPr>
+          <w:bCs/>
+          <w:b/>
+        </w:rPr>
+        <w:t xml:space="preserve"> </w:t>
+      </w:r>
+      <w:r>
+        <w:rPr>
+          <w:bCs/>
+          <w:b/>
+        </w:rPr>
+        <w:t xml:space="preserve">→</w:t>
+      </w:r>
+      <w:r>
+        <w:rPr>
+          <w:bCs/>
+          <w:b/>
+        </w:rPr>
+        <w:t xml:space="preserve"> </w:t>
+      </w:r>
+      <w:r>
+        <w:rPr>
+          <w:rStyle w:val="VerbatimChar"/>
+          <w:bCs/>
+          <w:b/>
+        </w:rPr>
+        <w:t xml:space="preserve">_longitudeFallback(longitude)</w:t>
+      </w:r>
+      <w:r>
+        <w:t xml:space="preserve"> </w:t>
+      </w:r>
+      <w:r>
+        <w:t xml:space="preserve">— ülke kodu</w:t>
+      </w:r>
+      <w:r>
+        <w:t xml:space="preserve"> </w:t>
+      </w:r>
+      <w:r>
+        <w:t xml:space="preserve">bilinmediğinde (okyanus koordinatları, kod içermeyen jeokodlama)</w:t>
+      </w:r>
+      <w:r>
+        <w:t xml:space="preserve"> </w:t>
+      </w:r>
+      <w:r>
+        <w:rPr>
+          <w:bCs/>
+          <w:b/>
+        </w:rPr>
+        <w:t xml:space="preserve">son</w:t>
+      </w:r>
+      <w:r>
+        <w:rPr>
+          <w:bCs/>
+          <w:b/>
+        </w:rPr>
+        <w:t xml:space="preserve"> </w:t>
+      </w:r>
+      <w:r>
+        <w:rPr>
+          <w:bCs/>
+          <w:b/>
+        </w:rPr>
+        <w:t xml:space="preserve">çare</w:t>
+      </w:r>
+      <w:r>
+        <w:t xml:space="preserve"> </w:t>
+      </w:r>
+      <w:r>
+        <w:t xml:space="preserve">olarak boylam/15 UTC-offset yaklaşımı.</w:t>
+      </w:r>
+      <w:r>
+        <w:t xml:space="preserve"> </w:t>
+      </w:r>
+      <w:r>
+        <w:t xml:space="preserve">4.</w:t>
+      </w:r>
+      <w:r>
+        <w:t xml:space="preserve"> </w:t>
+      </w:r>
+      <w:r>
+        <w:rPr>
+          <w:rStyle w:val="VerbatimChar"/>
+          <w:bCs/>
+          <w:b/>
+        </w:rPr>
+        <w:t xml:space="preserve">getCachedTimezone()</w:t>
+      </w:r>
+      <w:r>
+        <w:t xml:space="preserve"> </w:t>
+      </w:r>
+      <w:r>
+        <w:t xml:space="preserve">— SharedPreferences önbelleğinden son bilinen değer.</w:t>
+      </w:r>
+    </w:p>
+    <w:p>
+      <w:pPr>
+        <w:pStyle w:val="BodyText"/>
+      </w:pPr>
+      <w:r>
+        <w:rPr>
+          <w:bCs/>
+          <w:b/>
+        </w:rPr>
+        <w:t xml:space="preserve">Boylam-bandı fallback’inin doğruluk sınırları:</w:t>
+      </w:r>
+      <w:r>
+        <w:t xml:space="preserve"> </w:t>
+      </w:r>
+      <w:r>
+        <w:t xml:space="preserve">-</w:t>
+      </w:r>
+      <w:r>
+        <w:t xml:space="preserve"> </w:t>
+      </w:r>
+      <w:r>
+        <w:rPr>
+          <w:bCs/>
+          <w:b/>
+        </w:rPr>
+        <w:t xml:space="preserve">Ne zaman kullanılır:</w:t>
+      </w:r>
+      <w:r>
+        <w:t xml:space="preserve"> </w:t>
+      </w:r>
+      <w:r>
+        <w:t xml:space="preserve">Yalnızca (a) çok-zamanlı bir ülkede şehir seçimi</w:t>
+      </w:r>
+      <w:r>
+        <w:t xml:space="preserve"> </w:t>
+      </w:r>
+      <w:r>
+        <w:t xml:space="preserve">veya (b) ülke kodu hiç çözümlenemediğinde. Kalıcı tam IANA kimliği varsa</w:t>
+      </w:r>
+      <w:r>
+        <w:t xml:space="preserve"> </w:t>
+      </w:r>
+      <w:r>
+        <w:rPr>
+          <w:bCs/>
+          <w:b/>
+        </w:rPr>
+        <w:t xml:space="preserve">asla</w:t>
+      </w:r>
+      <w:r>
+        <w:t xml:space="preserve"> </w:t>
+      </w:r>
+      <w:r>
+        <w:t xml:space="preserve">kullanılmaz.</w:t>
+      </w:r>
+      <w:r>
+        <w:t xml:space="preserve"> </w:t>
+      </w:r>
+      <w:r>
+        <w:t xml:space="preserve">-</w:t>
+      </w:r>
+      <w:r>
+        <w:t xml:space="preserve"> </w:t>
+      </w:r>
+      <w:r>
+        <w:rPr>
+          <w:bCs/>
+          <w:b/>
+        </w:rPr>
+        <w:t xml:space="preserve">Belirsiz olabilecek bölgeler:</w:t>
+      </w:r>
+      <w:r>
+        <w:t xml:space="preserve"> </w:t>
+      </w:r>
+      <w:r>
+        <w:t xml:space="preserve">Çok-zamanlı ülkelerin zaman dilimi</w:t>
+      </w:r>
+      <w:r>
+        <w:t xml:space="preserve"> </w:t>
+      </w:r>
+      <w:r>
+        <w:t xml:space="preserve">sınırlarına yakın şehirler (örn. ABD’de Indiana/Kentucky bölünmeleri,</w:t>
+      </w:r>
+      <w:r>
+        <w:t xml:space="preserve"> </w:t>
+      </w:r>
+      <w:r>
+        <w:t xml:space="preserve">Avustralya’da Broken Hill, Rusya’da bölge sınırları); okyanus/uluslararası</w:t>
+      </w:r>
+      <w:r>
+        <w:t xml:space="preserve"> </w:t>
+      </w:r>
+      <w:r>
+        <w:t xml:space="preserve">sular koordinatları; küçük/ihtilaflı bölgeler ve komşu ülke sınırındaki</w:t>
+      </w:r>
+      <w:r>
+        <w:t xml:space="preserve"> </w:t>
+      </w:r>
+      <w:r>
+        <w:t xml:space="preserve">yerleşimler. Bu durumlarda komşu bir zaman dilimi seçilebilir (tipik hata:</w:t>
+      </w:r>
+      <w:r>
+        <w:t xml:space="preserve"> </w:t>
+      </w:r>
+      <w:r>
+        <w:t xml:space="preserve">±1 saat).</w:t>
+      </w:r>
+      <w:r>
+        <w:t xml:space="preserve"> </w:t>
+      </w:r>
+      <w:r>
+        <w:t xml:space="preserve">-</w:t>
+      </w:r>
+      <w:r>
+        <w:t xml:space="preserve"> </w:t>
+      </w:r>
+      <w:r>
+        <w:rPr>
+          <w:bCs/>
+          <w:b/>
+        </w:rPr>
+        <w:t xml:space="preserve">Tam IANA belirlenemediğinde ne olur:</w:t>
+      </w:r>
+      <w:r>
+        <w:t xml:space="preserve"> </w:t>
+      </w:r>
+      <w:r>
+        <w:t xml:space="preserve">Uygulama</w:t>
+      </w:r>
+      <w:r>
+        <w:t xml:space="preserve"> </w:t>
+      </w:r>
+      <w:r>
+        <w:rPr>
+          <w:bCs/>
+          <w:b/>
+        </w:rPr>
+        <w:t xml:space="preserve">çökmez</w:t>
+      </w:r>
+      <w:r>
+        <w:t xml:space="preserve"> </w:t>
+      </w:r>
+      <w:r>
+        <w:t xml:space="preserve">— sırasıyla</w:t>
+      </w:r>
+      <w:r>
+        <w:t xml:space="preserve"> </w:t>
+      </w:r>
+      <w:r>
+        <w:t xml:space="preserve">ülke-kodu tablosu → boylam yaklaşımı → önbellek → (hepsi başarısızsa) UTC</w:t>
+      </w:r>
+      <w:r>
+        <w:t xml:space="preserve"> </w:t>
+      </w:r>
+      <w:r>
+        <w:t xml:space="preserve">varsayılanına düşülür ve namaz vakitleri yine de hesaplanır. Kullanıcıya</w:t>
+      </w:r>
+      <w:r>
+        <w:t xml:space="preserve"> </w:t>
+      </w:r>
+      <w:r>
+        <w:t xml:space="preserve">yanlış zaman diliminde vakit gösterme riski, yalnızca yukarıdaki sınır</w:t>
+      </w:r>
+      <w:r>
+        <w:t xml:space="preserve"> </w:t>
+      </w:r>
+      <w:r>
+        <w:t xml:space="preserve">durumlarıyla sınırlıdır.</w:t>
+      </w:r>
+    </w:p>
+    <w:p>
+      <w:pPr>
+        <w:pStyle w:val="BodyText"/>
+      </w:pPr>
+      <w:r>
+        <w:rPr>
+          <w:bCs/>
+          <w:b/>
+        </w:rPr>
+        <w:t xml:space="preserve">Sonuç:</w:t>
+      </w:r>
+      <w:r>
+        <w:t xml:space="preserve"> </w:t>
+      </w:r>
+      <w:r>
+        <w:t xml:space="preserve">Kalıcı tam IANA kimliği önce tercih edildiğinden ve yaygın</w:t>
+      </w:r>
+      <w:r>
+        <w:t xml:space="preserve"> </w:t>
+      </w:r>
+      <w:r>
+        <w:t xml:space="preserve">şehirlerin tamamı ülke-kodu tablosuyla doğru çözümlendiğinden, mevcut mimari</w:t>
+      </w:r>
+      <w:r>
+        <w:t xml:space="preserve"> </w:t>
+      </w:r>
+      <w:r>
+        <w:t xml:space="preserve">V1 için yeterlidir.</w:t>
+      </w:r>
+      <w:r>
+        <w:t xml:space="preserve"> </w:t>
+      </w:r>
+      <w:r>
+        <w:rPr>
+          <w:bCs/>
+          <w:b/>
+        </w:rPr>
+        <w:t xml:space="preserve">Düzeltme gerektiren gerçek bir doğruluk hatası</w:t>
+      </w:r>
+      <w:r>
+        <w:rPr>
+          <w:bCs/>
+          <w:b/>
+        </w:rPr>
+        <w:t xml:space="preserve"> </w:t>
+      </w:r>
+      <w:r>
+        <w:rPr>
+          <w:bCs/>
+          <w:b/>
+        </w:rPr>
+        <w:t xml:space="preserve">bulunmamıştır.</w:t>
+      </w:r>
+      <w:r>
+        <w:t xml:space="preserve"> </w:t>
+      </w:r>
+      <w:r>
+        <w:t xml:space="preserve">İleride kullanıcı tarafından manuel zaman dilimi seçimi</w:t>
+      </w:r>
+      <w:r>
+        <w:t xml:space="preserve"> </w:t>
+      </w:r>
+      <w:r>
+        <w:t xml:space="preserve">(Settings) ve gerçek bir enlem/boylam→IANA poligon veri seti (örn.</w:t>
+      </w:r>
+      <w:r>
+        <w:t xml:space="preserve"> </w:t>
+      </w:r>
+      <w:r>
+        <w:rPr>
+          <w:rStyle w:val="VerbatimChar"/>
+        </w:rPr>
+        <w:t xml:space="preserve">tz_world</w:t>
+      </w:r>
+      <w:r>
+        <w:t xml:space="preserve">)</w:t>
+      </w:r>
+      <w:r>
+        <w:t xml:space="preserve"> </w:t>
+      </w:r>
+      <w:r>
+        <w:t xml:space="preserve">teknik borç olarak kaydedilmiştir (bkz. Bölüm 37).</w:t>
+      </w:r>
+    </w:p>
+    <w:bookmarkEnd w:id="63"/>
+    <w:bookmarkStart w:id="64" w:name="namaz-vakti-doğrulama-durumu"/>
+    <w:p>
+      <w:pPr>
+        <w:pStyle w:val="Heading3"/>
+      </w:pPr>
+      <w:r>
+        <w:t xml:space="preserve">41.5 Namaz Vakti Doğrulama Durumu</w:t>
+      </w:r>
+    </w:p>
+    <w:p>
+      <w:pPr>
+        <w:pStyle w:val="BlockText"/>
+      </w:pPr>
+      <w:r>
+        <w:rPr>
+          <w:bCs/>
+          <w:b/>
+        </w:rPr>
+        <w:t xml:space="preserve">ÖNEMLİ AYRIM:</w:t>
+      </w:r>
+      <w:r>
+        <w:t xml:space="preserve"> </w:t>
+      </w:r>
+      <w:r>
+        <w:t xml:space="preserve">Bu projede yapılan doğrulama,</w:t>
+      </w:r>
+      <w:r>
+        <w:t xml:space="preserve"> </w:t>
+      </w:r>
+      <w:r>
+        <w:rPr>
+          <w:bCs/>
+          <w:b/>
+        </w:rPr>
+        <w:t xml:space="preserve">AlAdhan Method 13</w:t>
+      </w:r>
+      <w:r>
+        <w:rPr>
+          <w:bCs/>
+          <w:b/>
+        </w:rPr>
+        <w:t xml:space="preserve"> </w:t>
+      </w:r>
+      <w:r>
+        <w:rPr>
+          <w:bCs/>
+          <w:b/>
+        </w:rPr>
+        <w:t xml:space="preserve">uyumluluğudur — resmî Diyanet doğrulaması DEĞİLDİR.</w:t>
+      </w:r>
+    </w:p>
+    <w:p>
+      <w:pPr>
+        <w:numPr>
+          <w:ilvl w:val="0"/>
+          <w:numId w:val="1021"/>
+        </w:numPr>
+        <w:pStyle w:val="Compact"/>
+      </w:pPr>
+      <w:r>
+        <w:rPr>
+          <w:rStyle w:val="VerbatimChar"/>
+        </w:rPr>
+        <w:t xml:space="preserve">adhan_prayer_time_provider_test.dart</w:t>
+      </w:r>
+      <w:r>
+        <w:t xml:space="preserve">, İstanbul (2024-03-15) için hesaplanan</w:t>
+      </w:r>
+      <w:r>
+        <w:t xml:space="preserve"> </w:t>
+      </w:r>
+      <w:r>
+        <w:t xml:space="preserve">vakitleri</w:t>
+      </w:r>
+      <w:r>
+        <w:t xml:space="preserve"> </w:t>
+      </w:r>
+      <w:r>
+        <w:rPr>
+          <w:bCs/>
+          <w:b/>
+        </w:rPr>
+        <w:t xml:space="preserve">AlAdhan API Method 13</w:t>
+      </w:r>
+      <w:r>
+        <w:t xml:space="preserve"> </w:t>
+      </w:r>
+      <w:r>
+        <w:t xml:space="preserve">referansıyla ±2 dakika toleransında</w:t>
+      </w:r>
+      <w:r>
+        <w:t xml:space="preserve"> </w:t>
+      </w:r>
+      <w:r>
+        <w:t xml:space="preserve">karşılaştırır. Bu yalnızca AlAdhan’ın Diyanet metodolojisi uygulamasıyla</w:t>
+      </w:r>
+      <w:r>
+        <w:t xml:space="preserve"> </w:t>
+      </w:r>
+      <w:r>
+        <w:rPr>
+          <w:bCs/>
+          <w:b/>
+        </w:rPr>
+        <w:t xml:space="preserve">uyumluluğu</w:t>
+      </w:r>
+      <w:r>
+        <w:t xml:space="preserve"> </w:t>
+      </w:r>
+      <w:r>
+        <w:t xml:space="preserve">gösterir.</w:t>
+      </w:r>
+    </w:p>
+    <w:p>
+      <w:pPr>
+        <w:numPr>
+          <w:ilvl w:val="0"/>
+          <w:numId w:val="1021"/>
+        </w:numPr>
+        <w:pStyle w:val="Compact"/>
+      </w:pPr>
+      <w:r>
+        <w:rPr>
+          <w:bCs/>
+          <w:b/>
+        </w:rPr>
+        <w:t xml:space="preserve">Resmî Diyanet doğrulaması ayrı ve bekleyen bir görevdir.</w:t>
+      </w:r>
+      <w:r>
+        <w:t xml:space="preserve"> </w:t>
+      </w:r>
+      <w:r>
+        <w:t xml:space="preserve">Bunun için:</w:t>
+      </w:r>
+    </w:p>
+    <w:p>
+      <w:pPr>
+        <w:numPr>
+          <w:ilvl w:val="1"/>
+          <w:numId w:val="1022"/>
+        </w:numPr>
+        <w:pStyle w:val="Compact"/>
+      </w:pPr>
+      <w:r>
+        <w:t xml:space="preserve">Hedef şehirler:</w:t>
+      </w:r>
+      <w:r>
+        <w:t xml:space="preserve"> </w:t>
+      </w:r>
+      <w:r>
+        <w:rPr>
+          <w:bCs/>
+          <w:b/>
+        </w:rPr>
+        <w:t xml:space="preserve">İstanbul, Ankara, Diyarbakır, Trabzon, Antalya</w:t>
+      </w:r>
+    </w:p>
+    <w:p>
+      <w:pPr>
+        <w:numPr>
+          <w:ilvl w:val="1"/>
+          <w:numId w:val="1022"/>
+        </w:numPr>
+        <w:pStyle w:val="Compact"/>
+      </w:pPr>
+      <w:r>
+        <w:t xml:space="preserve">Kapsam:</w:t>
+      </w:r>
+      <w:r>
+        <w:t xml:space="preserve"> </w:t>
+      </w:r>
+      <w:r>
+        <w:rPr>
+          <w:bCs/>
+          <w:b/>
+        </w:rPr>
+        <w:t xml:space="preserve">4 mevsim</w:t>
+      </w:r>
+      <w:r>
+        <w:t xml:space="preserve"> </w:t>
+      </w:r>
+      <w:r>
+        <w:t xml:space="preserve">(ekinoks/gündönümü civarı tarihler)</w:t>
+      </w:r>
+    </w:p>
+    <w:p>
+      <w:pPr>
+        <w:numPr>
+          <w:ilvl w:val="1"/>
+          <w:numId w:val="1022"/>
+        </w:numPr>
+        <w:pStyle w:val="Compact"/>
+      </w:pPr>
+      <w:r>
+        <w:t xml:space="preserve">Referans: Diyanet’in resmî yayınlanmış namaz vakti takvimi</w:t>
+      </w:r>
+    </w:p>
+    <w:p>
+      <w:pPr>
+        <w:numPr>
+          <w:ilvl w:val="1"/>
+          <w:numId w:val="1022"/>
+        </w:numPr>
+        <w:pStyle w:val="Compact"/>
+      </w:pPr>
+      <w:r>
+        <w:t xml:space="preserve">Durum:</w:t>
+      </w:r>
+      <w:r>
+        <w:t xml:space="preserve"> </w:t>
+      </w:r>
+      <w:r>
+        <w:rPr>
+          <w:bCs/>
+          <w:b/>
+        </w:rPr>
+        <w:t xml:space="preserve">BEKLEMEDE</w:t>
+      </w:r>
+      <w:r>
+        <w:t xml:space="preserve"> </w:t>
+      </w:r>
+      <w:r>
+        <w:t xml:space="preserve">— resmî Diyanet referans değerleri henüz mevcut</w:t>
+      </w:r>
+      <w:r>
+        <w:t xml:space="preserve"> </w:t>
+      </w:r>
+      <w:r>
+        <w:t xml:space="preserve">olmadığından bu doğrulama yapılmamıştır. Bu</w:t>
+      </w:r>
+      <w:r>
+        <w:t xml:space="preserve"> </w:t>
+      </w:r>
+      <w:r>
+        <w:rPr>
+          <w:bCs/>
+          <w:b/>
+        </w:rPr>
+        <w:t xml:space="preserve">Phase 4’ü bloke etmez</w:t>
+      </w:r>
+      <w:r>
+        <w:t xml:space="preserve">,</w:t>
+      </w:r>
+      <w:r>
+        <w:t xml:space="preserve"> </w:t>
+      </w:r>
+      <w:r>
+        <w:t xml:space="preserve">ancak sınırlama belgelenmiş olarak kalır.</w:t>
+      </w:r>
+    </w:p>
+    <w:p>
+      <w:pPr>
+        <w:numPr>
+          <w:ilvl w:val="0"/>
+          <w:numId w:val="1021"/>
+        </w:numPr>
+        <w:pStyle w:val="Compact"/>
+      </w:pPr>
+      <w:r>
+        <w:rPr>
+          <w:bCs/>
+          <w:b/>
+        </w:rPr>
+        <w:t xml:space="preserve">Uydurma/tahmini Diyanet değeri kullanılmamıştır.</w:t>
+      </w:r>
+      <w:r>
+        <w:t xml:space="preserve"> </w:t>
+      </w:r>
+      <w:r>
+        <w:t xml:space="preserve">İlgili 20 test,</w:t>
+      </w:r>
+      <w:r>
+        <w:t xml:space="preserve"> </w:t>
+      </w:r>
+      <w:r>
+        <w:t xml:space="preserve">gerçek referans verisi doldurulana kadar bilinçli olarak</w:t>
+      </w:r>
+      <w:r>
+        <w:t xml:space="preserve"> </w:t>
+      </w:r>
+      <w:r>
+        <w:rPr>
+          <w:rStyle w:val="VerbatimChar"/>
+        </w:rPr>
+        <w:t xml:space="preserve">skip:</w:t>
+      </w:r>
+      <w:r>
+        <w:t xml:space="preserve"> </w:t>
+      </w:r>
+      <w:r>
+        <w:t xml:space="preserve">işaretlidir (bkz. Bölüm 31–32).</w:t>
+      </w:r>
+    </w:p>
+    <w:p>
+      <w:pPr>
+        <w:numPr>
+          <w:ilvl w:val="0"/>
+          <w:numId w:val="1021"/>
+        </w:numPr>
+        <w:pStyle w:val="Compact"/>
+      </w:pPr>
+      <w:r>
+        <w:t xml:space="preserve">Ayrı resmî-Diyanet doğrulama TODO’su: bkz. Bölüm 40.1 ve</w:t>
+      </w:r>
+      <w:r>
+        <w:t xml:space="preserve"> </w:t>
+      </w:r>
+      <w:r>
+        <w:rPr>
+          <w:rStyle w:val="VerbatimChar"/>
+        </w:rPr>
+        <w:t xml:space="preserve">REAL_DEVICE_TEST_CHECKLIST.md</w:t>
+      </w:r>
+      <w:r>
+        <w:t xml:space="preserve">.</w:t>
+      </w:r>
+    </w:p>
+    <w:bookmarkEnd w:id="64"/>
+    <w:bookmarkStart w:id="65" w:name="gerçek-cihaz-doğrulaması-durumu"/>
+    <w:p>
+      <w:pPr>
+        <w:pStyle w:val="Heading3"/>
+      </w:pPr>
+      <w:r>
+        <w:t xml:space="preserve">41.6 Gerçek Cihaz Doğrulaması Durumu</w:t>
+      </w:r>
+    </w:p>
+    <w:p>
+      <w:pPr>
+        <w:numPr>
+          <w:ilvl w:val="0"/>
+          <w:numId w:val="1023"/>
+        </w:numPr>
+        <w:pStyle w:val="Compact"/>
+      </w:pPr>
+      <w:r>
+        <w:rPr>
+          <w:rStyle w:val="VerbatimChar"/>
+        </w:rPr>
+        <w:t xml:space="preserve">REAL_DEVICE_TEST_CHECKLIST.md</w:t>
+      </w:r>
+      <w:r>
+        <w:t xml:space="preserve"> </w:t>
+      </w:r>
+      <w:r>
+        <w:t xml:space="preserve">(51 madde)</w:t>
+      </w:r>
+      <w:r>
+        <w:t xml:space="preserve"> </w:t>
+      </w:r>
+      <w:r>
+        <w:rPr>
+          <w:bCs/>
+          <w:b/>
+        </w:rPr>
+        <w:t xml:space="preserve">BEKLEMEDE</w:t>
+      </w:r>
+      <w:r>
+        <w:t xml:space="preserve"> </w:t>
+      </w:r>
+      <w:r>
+        <w:t xml:space="preserve">olarak korunmuştur.</w:t>
+      </w:r>
+    </w:p>
+    <w:p>
+      <w:pPr>
+        <w:numPr>
+          <w:ilvl w:val="0"/>
+          <w:numId w:val="1023"/>
+        </w:numPr>
+        <w:pStyle w:val="Compact"/>
+      </w:pPr>
+      <w:r>
+        <w:rPr>
+          <w:bCs/>
+          <w:b/>
+        </w:rPr>
+        <w:t xml:space="preserve">Hiçbir yapılmamış cihaz testi başarılı olarak işaretlenmemiştir.</w:t>
+      </w:r>
+    </w:p>
+    <w:p>
+      <w:pPr>
+        <w:numPr>
+          <w:ilvl w:val="0"/>
+          <w:numId w:val="1023"/>
+        </w:numPr>
+        <w:pStyle w:val="Compact"/>
+      </w:pPr>
+      <w:r>
+        <w:t xml:space="preserve">Doğrulama seviyeleri ayrımı:</w:t>
+      </w:r>
+    </w:p>
+    <w:p>
+      <w:pPr>
+        <w:numPr>
+          <w:ilvl w:val="1"/>
+          <w:numId w:val="1024"/>
+        </w:numPr>
+        <w:pStyle w:val="Compact"/>
+      </w:pPr>
+      <w:r>
+        <w:rPr>
+          <w:bCs/>
+          <w:b/>
+        </w:rPr>
+        <w:t xml:space="preserve">Otomatik PASS:</w:t>
+      </w:r>
+      <w:r>
+        <w:t xml:space="preserve"> </w:t>
+      </w:r>
+      <w:r>
+        <w:t xml:space="preserve">155 birim/widget testi (bu makinede doğrulandı) ✓</w:t>
+      </w:r>
+    </w:p>
+    <w:p>
+      <w:pPr>
+        <w:numPr>
+          <w:ilvl w:val="1"/>
+          <w:numId w:val="1024"/>
+        </w:numPr>
+        <w:pStyle w:val="Compact"/>
+      </w:pPr>
+      <w:r>
+        <w:rPr>
+          <w:bCs/>
+          <w:b/>
+        </w:rPr>
+        <w:t xml:space="preserve">Emülatör PASS:</w:t>
+      </w:r>
+      <w:r>
+        <w:t xml:space="preserve"> </w:t>
+      </w:r>
+      <w:r>
+        <w:t xml:space="preserve">Uygulanmadı — TEST EDİLMEDİ</w:t>
+      </w:r>
+    </w:p>
+    <w:p>
+      <w:pPr>
+        <w:numPr>
+          <w:ilvl w:val="1"/>
+          <w:numId w:val="1024"/>
+        </w:numPr>
+        <w:pStyle w:val="Compact"/>
+      </w:pPr>
+      <w:r>
+        <w:rPr>
+          <w:bCs/>
+          <w:b/>
+        </w:rPr>
+        <w:t xml:space="preserve">Fiziksel cihaz PASS:</w:t>
+      </w:r>
+      <w:r>
+        <w:t xml:space="preserve"> </w:t>
+      </w:r>
+      <w:r>
+        <w:t xml:space="preserve">Uygulanmadı — TEST EDİLMEDİ (BLOKE: fiziksel</w:t>
+      </w:r>
+      <w:r>
+        <w:t xml:space="preserve"> </w:t>
+      </w:r>
+      <w:r>
+        <w:t xml:space="preserve">Android/iOS cihaz erişimi yok)</w:t>
+      </w:r>
+    </w:p>
+    <w:p>
+      <w:pPr>
+        <w:numPr>
+          <w:ilvl w:val="1"/>
+          <w:numId w:val="1024"/>
+        </w:numPr>
+        <w:pStyle w:val="Compact"/>
+      </w:pPr>
+      <w:r>
+        <w:rPr>
+          <w:bCs/>
+          <w:b/>
+        </w:rPr>
+        <w:t xml:space="preserve">APK derlemesi:</w:t>
+      </w:r>
+      <w:r>
+        <w:t xml:space="preserve"> </w:t>
+      </w:r>
+      <w:r>
+        <w:t xml:space="preserve">BAŞARILI ✓ (kurulum/çalıştırma cihazda doğrulanmadı)</w:t>
+      </w:r>
+    </w:p>
+    <w:bookmarkEnd w:id="65"/>
+    <w:bookmarkStart w:id="66" w:name="regresyon-kapsamı-otomatik-test-onayı"/>
+    <w:p>
+      <w:pPr>
+        <w:pStyle w:val="Heading3"/>
+      </w:pPr>
+      <w:r>
+        <w:t xml:space="preserve">41.7 Regresyon Kapsamı (Otomatik Test Onayı)</w:t>
+      </w:r>
+    </w:p>
+    <w:p>
+      <w:pPr>
+        <w:pStyle w:val="FirstParagraph"/>
+      </w:pPr>
+      <w:r>
+        <w:t xml:space="preserve">Aşağıdaki senaryoların tamamı için otomatik test kapsamı</w:t>
+      </w:r>
+      <w:r>
+        <w:t xml:space="preserve"> </w:t>
+      </w:r>
+      <w:r>
+        <w:rPr>
+          <w:bCs/>
+          <w:b/>
+        </w:rPr>
+        <w:t xml:space="preserve">mevcut ve geçer</w:t>
+      </w:r>
+      <w:r>
+        <w:t xml:space="preserve"> </w:t>
+      </w:r>
+      <w:r>
+        <w:t xml:space="preserve">durumdadır:</w:t>
+      </w:r>
+    </w:p>
+    <w:tbl>
+      <w:tblPr>
+        <w:tblStyle w:val="Table"/>
+        <w:tblW w:type="pct" w:w="5000"/>
+        <w:tblLook w:firstRow="1" w:lastRow="0" w:firstColumn="0" w:lastColumn="0" w:noHBand="0" w:noVBand="0" w:val="0020"/>
+      </w:tblPr>
+      <w:tblGrid>
+        <w:gridCol w:w="3960"/>
+        <w:gridCol w:w="3960"/>
+      </w:tblGrid>
+      <w:tr>
+        <w:trPr>
+          <w:tblHeader w:val="true"/>
+        </w:trPr>
+        <w:tc>
+          <w:tcPr/>
+          <w:p>
+            <w:pPr>
+              <w:pStyle w:val="Compact"/>
+              <w:jc w:val="left"/>
+            </w:pPr>
+            <w:r>
+              <w:t xml:space="preserve">Senaryo</w:t>
+            </w:r>
+          </w:p>
+        </w:tc>
+        <w:tc>
+          <w:tcPr/>
+          <w:p>
+            <w:pPr>
+              <w:pStyle w:val="Compact"/>
+              <w:jc w:val="left"/>
+            </w:pPr>
+            <w:r>
+              <w:t xml:space="preserve">Test konumu</w:t>
+            </w:r>
+          </w:p>
+        </w:tc>
+      </w:tr>
+      <w:tr>
+        <w:tc>
+          <w:tcPr/>
+          <w:p>
+            <w:pPr>
+              <w:pStyle w:val="Compact"/>
+              <w:jc w:val="left"/>
+            </w:pPr>
+            <w:r>
+              <w:t xml:space="preserve">Bugün/yarın vakit hesabı</w:t>
+            </w:r>
+          </w:p>
+        </w:tc>
+        <w:tc>
+          <w:tcPr/>
+          <w:p>
+            <w:pPr>
+              <w:pStyle w:val="Compact"/>
+              <w:jc w:val="left"/>
+            </w:pPr>
+            <w:r>
+              <w:rPr>
+                <w:rStyle w:val="VerbatimChar"/>
+              </w:rPr>
+              <w:t xml:space="preserve">home_cubit_test.dart</w:t>
+            </w:r>
+            <w:r>
+              <w:t xml:space="preserve">,</w:t>
+            </w:r>
+            <w:r>
+              <w:t xml:space="preserve"> </w:t>
+            </w:r>
+            <w:r>
+              <w:rPr>
+                <w:rStyle w:val="VerbatimChar"/>
+              </w:rPr>
+              <w:t xml:space="preserve">prayer_time_utils_test.dart</w:t>
+            </w:r>
+          </w:p>
+        </w:tc>
+      </w:tr>
+      <w:tr>
+        <w:tc>
+          <w:tcPr/>
+          <w:p>
+            <w:pPr>
+              <w:pStyle w:val="Compact"/>
+              <w:jc w:val="left"/>
+            </w:pPr>
+            <w:r>
+              <w:t xml:space="preserve">Yatsı sonrası → yarının İmsak’ı</w:t>
+            </w:r>
+          </w:p>
+        </w:tc>
+        <w:tc>
+          <w:tcPr/>
+          <w:p>
+            <w:pPr>
+              <w:pStyle w:val="Compact"/>
+              <w:jc w:val="left"/>
+            </w:pPr>
+            <w:r>
+              <w:rPr>
+                <w:rStyle w:val="VerbatimChar"/>
+              </w:rPr>
+              <w:t xml:space="preserve">prayer_time_utils_test.dart</w:t>
+            </w:r>
+            <w:r>
+              <w:t xml:space="preserve"> </w:t>
+            </w:r>
+            <w:r>
+              <w:t xml:space="preserve">(T),</w:t>
+            </w:r>
+            <w:r>
+              <w:t xml:space="preserve"> </w:t>
+            </w:r>
+            <w:r>
+              <w:rPr>
+                <w:rStyle w:val="VerbatimChar"/>
+              </w:rPr>
+              <w:t xml:space="preserve">get_next_prayer_usecase_test.dart</w:t>
+            </w:r>
+            <w:r>
+              <w:t xml:space="preserve">,</w:t>
+            </w:r>
+            <w:r>
+              <w:t xml:space="preserve"> </w:t>
+            </w:r>
+            <w:r>
+              <w:rPr>
+                <w:rStyle w:val="VerbatimChar"/>
+              </w:rPr>
+              <w:t xml:space="preserve">home_cubit_test.dart</w:t>
+            </w:r>
+            <w:r>
+              <w:t xml:space="preserve"> </w:t>
+            </w:r>
+            <w:r>
+              <w:t xml:space="preserve">T12/T13</w:t>
+            </w:r>
+          </w:p>
+        </w:tc>
+      </w:tr>
+      <w:tr>
+        <w:tc>
+          <w:tcPr/>
+          <w:p>
+            <w:pPr>
+              <w:pStyle w:val="Compact"/>
+              <w:jc w:val="left"/>
+            </w:pPr>
+            <w:r>
+              <w:t xml:space="preserve">Güneş (Sunrise)</w:t>
+            </w:r>
+            <w:r>
+              <w:t xml:space="preserve"> </w:t>
+            </w:r>
+            <w:r>
+              <w:t xml:space="preserve">“</w:t>
+            </w:r>
+            <w:r>
+              <w:t xml:space="preserve">Sıradaki Vakit</w:t>
+            </w:r>
+            <w:r>
+              <w:t xml:space="preserve">”</w:t>
+            </w:r>
+            <w:r>
+              <w:t xml:space="preserve">ten hariç</w:t>
+            </w:r>
+          </w:p>
+        </w:tc>
+        <w:tc>
+          <w:tcPr/>
+          <w:p>
+            <w:pPr>
+              <w:pStyle w:val="Compact"/>
+              <w:jc w:val="left"/>
+            </w:pPr>
+            <w:r>
+              <w:rPr>
+                <w:rStyle w:val="VerbatimChar"/>
+              </w:rPr>
+              <w:t xml:space="preserve">home_widget_test.dart</w:t>
+            </w:r>
+            <w:r>
+              <w:t xml:space="preserve"> </w:t>
+            </w:r>
+            <w:r>
+              <w:t xml:space="preserve">T31</w:t>
+            </w:r>
+          </w:p>
+        </w:tc>
+      </w:tr>
+      <w:tr>
+        <w:tc>
+          <w:tcPr/>
+          <w:p>
+            <w:pPr>
+              <w:pStyle w:val="Compact"/>
+              <w:jc w:val="left"/>
+            </w:pPr>
+            <w:r>
+              <w:t xml:space="preserve">Geri sayım vakit anı sınırı</w:t>
+            </w:r>
+          </w:p>
+        </w:tc>
+        <w:tc>
+          <w:tcPr/>
+          <w:p>
+            <w:pPr>
+              <w:pStyle w:val="Compact"/>
+              <w:jc w:val="left"/>
+            </w:pPr>
+            <w:r>
+              <w:rPr>
+                <w:rStyle w:val="VerbatimChar"/>
+              </w:rPr>
+              <w:t xml:space="preserve">home_cubit_test.dart</w:t>
+            </w:r>
+            <w:r>
+              <w:t xml:space="preserve"> </w:t>
+            </w:r>
+            <w:r>
+              <w:t xml:space="preserve">T14/T15/T23–T28</w:t>
+            </w:r>
+          </w:p>
+        </w:tc>
+      </w:tr>
+      <w:tr>
+        <w:tc>
+          <w:tcPr/>
+          <w:p>
+            <w:pPr>
+              <w:pStyle w:val="Compact"/>
+              <w:jc w:val="left"/>
+            </w:pPr>
+            <w:r>
+              <w:t xml:space="preserve">Gece yarısı devri (rollover)</w:t>
+            </w:r>
+          </w:p>
+        </w:tc>
+        <w:tc>
+          <w:tcPr/>
+          <w:p>
+            <w:pPr>
+              <w:pStyle w:val="Compact"/>
+              <w:jc w:val="left"/>
+            </w:pPr>
+            <w:r>
+              <w:rPr>
+                <w:rStyle w:val="VerbatimChar"/>
+              </w:rPr>
+              <w:t xml:space="preserve">home_cubit_test.dart</w:t>
+            </w:r>
+            <w:r>
+              <w:t xml:space="preserve"> </w:t>
+            </w:r>
+            <w:r>
+              <w:t xml:space="preserve">T17/T28</w:t>
+            </w:r>
+          </w:p>
+        </w:tc>
+      </w:tr>
+      <w:tr>
+        <w:tc>
+          <w:tcPr/>
+          <w:p>
+            <w:pPr>
+              <w:pStyle w:val="Compact"/>
+              <w:jc w:val="left"/>
+            </w:pPr>
+            <w:r>
+              <w:t xml:space="preserve">Yeniden başlatmadan konum değişikliği</w:t>
+            </w:r>
+          </w:p>
+        </w:tc>
+        <w:tc>
+          <w:tcPr/>
+          <w:p>
+            <w:pPr>
+              <w:pStyle w:val="Compact"/>
+              <w:jc w:val="left"/>
+            </w:pPr>
+            <w:r>
+              <w:rPr>
+                <w:rStyle w:val="VerbatimChar"/>
+              </w:rPr>
+              <w:t xml:space="preserve">home_location_change_test.dart</w:t>
+            </w:r>
+            <w:r>
+              <w:t xml:space="preserve"> </w:t>
+            </w:r>
+            <w:r>
+              <w:t xml:space="preserve">T41–T46</w:t>
+            </w:r>
+          </w:p>
+        </w:tc>
+      </w:tr>
+      <w:tr>
+        <w:tc>
+          <w:tcPr/>
+          <w:p>
+            <w:pPr>
+              <w:pStyle w:val="Compact"/>
+              <w:jc w:val="left"/>
+            </w:pPr>
+            <w:r>
+              <w:t xml:space="preserve">Seçili konum zaman dilimi (cihaz değil)</w:t>
+            </w:r>
+          </w:p>
+        </w:tc>
+        <w:tc>
+          <w:tcPr/>
+          <w:p>
+            <w:pPr>
+              <w:pStyle w:val="Compact"/>
+              <w:jc w:val="left"/>
+            </w:pPr>
+            <w:r>
+              <w:rPr>
+                <w:rStyle w:val="VerbatimChar"/>
+              </w:rPr>
+              <w:t xml:space="preserve">home_cubit_test.dart</w:t>
+            </w:r>
+            <w:r>
+              <w:t xml:space="preserve"> </w:t>
+            </w:r>
+            <w:r>
+              <w:t xml:space="preserve">FakeTimezoneRepository</w:t>
+            </w:r>
+          </w:p>
+        </w:tc>
+      </w:tr>
+      <w:tr>
+        <w:tc>
+          <w:tcPr/>
+          <w:p>
+            <w:pPr>
+              <w:pStyle w:val="Compact"/>
+              <w:jc w:val="left"/>
+            </w:pPr>
+            <w:r>
+              <w:t xml:space="preserve">Çevrimdışı önbellekli çalışma</w:t>
+            </w:r>
+          </w:p>
+        </w:tc>
+        <w:tc>
+          <w:tcPr/>
+          <w:p>
+            <w:pPr>
+              <w:pStyle w:val="Compact"/>
+              <w:jc w:val="left"/>
+            </w:pPr>
+            <w:r>
+              <w:rPr>
+                <w:rStyle w:val="VerbatimChar"/>
+              </w:rPr>
+              <w:t xml:space="preserve">home_offline_test.dart</w:t>
+            </w:r>
+            <w:r>
+              <w:t xml:space="preserve"> </w:t>
+            </w:r>
+            <w:r>
+              <w:t xml:space="preserve">T47–T49</w:t>
+            </w:r>
+          </w:p>
+        </w:tc>
+      </w:tr>
+      <w:tr>
+        <w:tc>
+          <w:tcPr/>
+          <w:p>
+            <w:pPr>
+              <w:pStyle w:val="Compact"/>
+              <w:jc w:val="left"/>
+            </w:pPr>
+            <w:r>
+              <w:t xml:space="preserve">Konum eksik durumu</w:t>
+            </w:r>
+          </w:p>
+        </w:tc>
+        <w:tc>
+          <w:tcPr/>
+          <w:p>
+            <w:pPr>
+              <w:pStyle w:val="Compact"/>
+              <w:jc w:val="left"/>
+            </w:pPr>
+            <w:r>
+              <w:rPr>
+                <w:rStyle w:val="VerbatimChar"/>
+              </w:rPr>
+              <w:t xml:space="preserve">home_cubit_test.dart</w:t>
+            </w:r>
+            <w:r>
+              <w:t xml:space="preserve"> </w:t>
+            </w:r>
+            <w:r>
+              <w:t xml:space="preserve">(HomeMissingLocation)</w:t>
+            </w:r>
+          </w:p>
+        </w:tc>
+      </w:tr>
+      <w:tr>
+        <w:tc>
+          <w:tcPr/>
+          <w:p>
+            <w:pPr>
+              <w:pStyle w:val="Compact"/>
+              <w:jc w:val="left"/>
+            </w:pPr>
+            <w:r>
+              <w:t xml:space="preserve">TR/EN/AR yerelleştirme</w:t>
+            </w:r>
+          </w:p>
+        </w:tc>
+        <w:tc>
+          <w:tcPr/>
+          <w:p>
+            <w:pPr>
+              <w:pStyle w:val="Compact"/>
+              <w:jc w:val="left"/>
+            </w:pPr>
+            <w:r>
+              <w:rPr>
+                <w:rStyle w:val="VerbatimChar"/>
+              </w:rPr>
+              <w:t xml:space="preserve">home_widget_test.dart</w:t>
+            </w:r>
+            <w:r>
+              <w:t xml:space="preserve"> </w:t>
+            </w:r>
+            <w:r>
+              <w:t xml:space="preserve">T34/T35/T37/T38</w:t>
+            </w:r>
+          </w:p>
+        </w:tc>
+      </w:tr>
+      <w:tr>
+        <w:tc>
+          <w:tcPr/>
+          <w:p>
+            <w:pPr>
+              <w:pStyle w:val="Compact"/>
+              <w:jc w:val="left"/>
+            </w:pPr>
+            <w:r>
+              <w:t xml:space="preserve">Arapça RTL</w:t>
+            </w:r>
+          </w:p>
+        </w:tc>
+        <w:tc>
+          <w:tcPr/>
+          <w:p>
+            <w:pPr>
+              <w:pStyle w:val="Compact"/>
+              <w:jc w:val="left"/>
+            </w:pPr>
+            <w:r>
+              <w:rPr>
+                <w:rStyle w:val="VerbatimChar"/>
+              </w:rPr>
+              <w:t xml:space="preserve">home_widget_test.dart</w:t>
+            </w:r>
+            <w:r>
+              <w:t xml:space="preserve"> </w:t>
+            </w:r>
+            <w:r>
+              <w:t xml:space="preserve">T36</w:t>
+            </w:r>
+          </w:p>
+        </w:tc>
+      </w:tr>
+    </w:tbl>
+    <w:bookmarkEnd w:id="66"/>
+    <w:bookmarkStart w:id="67" w:name="nihai-karar"/>
+    <w:p>
+      <w:pPr>
+        <w:pStyle w:val="Heading3"/>
+      </w:pPr>
+      <w:r>
+        <w:t xml:space="preserve">41.8 Nihai Karar</w:t>
+      </w:r>
+    </w:p>
+    <w:p>
+      <w:pPr>
+        <w:numPr>
+          <w:ilvl w:val="0"/>
+          <w:numId w:val="1025"/>
+        </w:numPr>
+        <w:pStyle w:val="Compact"/>
+      </w:pPr>
+      <w:r>
+        <w:t xml:space="preserve">Otomatik testler:</w:t>
+      </w:r>
+      <w:r>
+        <w:t xml:space="preserve"> </w:t>
+      </w:r>
+      <w:r>
+        <w:rPr>
+          <w:bCs/>
+          <w:b/>
+        </w:rPr>
+        <w:t xml:space="preserve">155/155 geçti</w:t>
+      </w:r>
+      <w:r>
+        <w:t xml:space="preserve"> </w:t>
+      </w:r>
+      <w:r>
+        <w:t xml:space="preserve">(20 bilinçli skip) ✓</w:t>
+      </w:r>
+    </w:p>
+    <w:p>
+      <w:pPr>
+        <w:numPr>
+          <w:ilvl w:val="0"/>
+          <w:numId w:val="1025"/>
+        </w:numPr>
+        <w:pStyle w:val="Compact"/>
+      </w:pPr>
+      <w:r>
+        <w:t xml:space="preserve">Statik analiz:</w:t>
+      </w:r>
+      <w:r>
+        <w:t xml:space="preserve"> </w:t>
+      </w:r>
+      <w:r>
+        <w:rPr>
+          <w:bCs/>
+          <w:b/>
+        </w:rPr>
+        <w:t xml:space="preserve">0 hata / 0 uyarı</w:t>
+      </w:r>
+      <w:r>
+        <w:t xml:space="preserve"> </w:t>
+      </w:r>
+      <w:r>
+        <w:t xml:space="preserve">✓</w:t>
+      </w:r>
+    </w:p>
+    <w:p>
+      <w:pPr>
+        <w:numPr>
+          <w:ilvl w:val="0"/>
+          <w:numId w:val="1025"/>
+        </w:numPr>
+        <w:pStyle w:val="Compact"/>
+      </w:pPr>
+      <w:r>
+        <w:t xml:space="preserve">Android debug APK:</w:t>
+      </w:r>
+      <w:r>
+        <w:t xml:space="preserve"> </w:t>
+      </w:r>
+      <w:r>
+        <w:rPr>
+          <w:bCs/>
+          <w:b/>
+        </w:rPr>
+        <w:t xml:space="preserve">başarıyla derlendi</w:t>
+      </w:r>
+      <w:r>
+        <w:t xml:space="preserve"> </w:t>
+      </w:r>
+      <w:r>
+        <w:t xml:space="preserve">✓</w:t>
+      </w:r>
+    </w:p>
+    <w:p>
+      <w:pPr>
+        <w:numPr>
+          <w:ilvl w:val="0"/>
+          <w:numId w:val="1025"/>
+        </w:numPr>
+        <w:pStyle w:val="Compact"/>
+      </w:pPr>
+      <w:r>
+        <w:t xml:space="preserve">Timezone mimarisi: gözden geçirildi, gerçek doğruluk hatası yok, sınırlar</w:t>
+      </w:r>
+      <w:r>
+        <w:t xml:space="preserve"> </w:t>
+      </w:r>
+      <w:r>
+        <w:t xml:space="preserve">belgelendi ✓</w:t>
+      </w:r>
+    </w:p>
+    <w:p>
+      <w:pPr>
+        <w:numPr>
+          <w:ilvl w:val="0"/>
+          <w:numId w:val="1025"/>
+        </w:numPr>
+        <w:pStyle w:val="Compact"/>
+      </w:pPr>
+      <w:r>
+        <w:t xml:space="preserve">Namaz vakti doğrulaması: AlAdhan uyumluluğu doğrulandı; resmî Diyanet</w:t>
+      </w:r>
+      <w:r>
+        <w:t xml:space="preserve"> </w:t>
+      </w:r>
+      <w:r>
+        <w:t xml:space="preserve">doğrulaması ayrı TODO olarak belgelendi ✓</w:t>
+      </w:r>
+    </w:p>
+    <w:p>
+      <w:pPr>
+        <w:numPr>
+          <w:ilvl w:val="0"/>
+          <w:numId w:val="1025"/>
+        </w:numPr>
+        <w:pStyle w:val="Compact"/>
+      </w:pPr>
+      <w:r>
+        <w:t xml:space="preserve">Gerçek cihaz testleri: bekleyen olarak korundu, yanlış PASS işareti yok ✓</w:t>
+      </w:r>
+    </w:p>
+    <w:p>
+      <w:pPr>
+        <w:pStyle w:val="FirstParagraph"/>
+      </w:pPr>
+      <w:r>
+        <w:rPr>
+          <w:bCs/>
+          <w:b/>
+        </w:rPr>
+        <w:t xml:space="preserve">PHASE 4 FINAL VALIDATION — tüm otomatik doğrulama ve Android derlemesi</w:t>
+      </w:r>
+      <w:r>
+        <w:rPr>
+          <w:bCs/>
+          <w:b/>
+        </w:rPr>
+        <w:t xml:space="preserve"> </w:t>
+      </w:r>
+      <w:r>
+        <w:rPr>
+          <w:bCs/>
+          <w:b/>
+        </w:rPr>
+        <w:t xml:space="preserve">başarılı.</w:t>
+      </w:r>
+    </w:p>
+    <w:p>
+      <w:r>
+        <w:pict>
+          <v:rect style="width:0;height:1.5pt" o:hralign="center" o:hrstd="t" o:hr="t"/>
+        </w:pict>
+      </w:r>
+    </w:p>
     <w:p>
       <w:pPr>
         <w:pStyle w:val="FirstParagraph"/>
@@ -7497,8 +10220,9 @@
         <w:t xml:space="preserve">End of Phase 4 Completion Report.</w:t>
       </w:r>
     </w:p>
-    <w:bookmarkEnd w:id="59"/>
-    <w:bookmarkEnd w:id="60"/>
+    <w:bookmarkEnd w:id="67"/>
+    <w:bookmarkEnd w:id="68"/>
+    <w:bookmarkEnd w:id="69"/>
     <w:sectPr/>
   </w:body>
 </w:document>
@@ -8068,6 +10792,27 @@
     </w:lvlOverride>
   </w:num>
   <w:num w:numId="1018">
+    <w:abstractNumId w:val="991"/>
+  </w:num>
+  <w:num w:numId="1019">
+    <w:abstractNumId w:val="991"/>
+  </w:num>
+  <w:num w:numId="1020">
+    <w:abstractNumId w:val="991"/>
+  </w:num>
+  <w:num w:numId="1021">
+    <w:abstractNumId w:val="991"/>
+  </w:num>
+  <w:num w:numId="1022">
+    <w:abstractNumId w:val="991"/>
+  </w:num>
+  <w:num w:numId="1023">
+    <w:abstractNumId w:val="991"/>
+  </w:num>
+  <w:num w:numId="1024">
+    <w:abstractNumId w:val="991"/>
+  </w:num>
+  <w:num w:numId="1025">
     <w:abstractNumId w:val="991"/>
   </w:num>
 </w:numbering>

</xml_diff>